<commit_message>
Update career history document
</commit_message>
<xml_diff>
--- a/docs/career_history.docx
+++ b/docs/career_history.docx
@@ -196,21 +196,119 @@
         </w:rPr>
       </w:pPr>
       <w:r>
-        <w:t>2019年8月に株式会社イケヒココーポレーションへ入社後、即日株式会社アイズコーポレーションへ出向し、EC事業における商品ページ制作およびディレクション業務に従事してまいりました。 楽天市場、Yahoo!ショッピング、Amazonなどの多店舗展開において、年間150～200ページの新商品ページ制作を展開。同社系列店舗にて楽天市場の「こたつ」カテゴリシェア約2割、「い草商品」カテゴリシェア3割超の獲得維持に貢献。 2022年からは5名体制の制作チームマネジメントを経験。その後、自社ECで培った「家具インテリア特化の撮影知見」および「モール最適化ノウハウ」を強みとした新規B2B事業（家具撮影LP制作受託サービス「PIXAZ」）の立ち上げに参画。同事業において年間約50ページの受託制作を牽引するなど、制作実務からマネジメント、新規事業のマネタイズに向けたスキーム構築まで幅広い役割を担っております。</w:t>
+        <w:rPr>
+          <w:rFonts w:ascii="メイリオ" w:eastAsia="メイリオ" w:hAnsi="メイリオ" w:cs="メイリオ"/>
+          <w:sz w:val="19"/>
+          <w:szCs w:val="19"/>
+        </w:rPr>
+        <w:t>2019年8月に株式会社イケヒコ・コーポレーションへ入社後、即日株式会社アイズコーポレーションへ出向し、EC事業における商品ページ制作およびディレクション業務に</w:t>
+      </w:r>
+      <w:r>
+        <w:rPr>
+          <w:rFonts w:ascii="メイリオ" w:eastAsia="メイリオ" w:hAnsi="メイリオ" w:cs="メイリオ" w:hint="eastAsia"/>
+          <w:sz w:val="19"/>
+          <w:szCs w:val="19"/>
+        </w:rPr>
+        <w:t>従事</w:t>
+      </w:r>
+      <w:r>
+        <w:rPr>
+          <w:rFonts w:ascii="メイリオ" w:eastAsia="メイリオ" w:hAnsi="メイリオ" w:cs="メイリオ"/>
+          <w:sz w:val="19"/>
+          <w:szCs w:val="19"/>
+        </w:rPr>
+        <w:t>してまいりました。 楽天市場、Yahoo!ショッピング、Amazonなどの多店舗展開において、年間150～200ページの新商品ページ制作を展開。同社系列店舗にて楽天市場の「こたつ」カテゴリシェア約2割、「い草商品」カテゴリシェア3割超の獲得・維持に貢献。 2022年からは5名体制の制作チームマネジメントを経験。その後、自社ECで培った「家</w:t>
+      </w:r>
+      <w:r>
+        <w:rPr>
+          <w:rFonts w:ascii="メイリオ" w:eastAsia="メイリオ" w:hAnsi="メイリオ" w:cs="メイリオ" w:hint="eastAsia"/>
+          <w:sz w:val="19"/>
+          <w:szCs w:val="19"/>
+        </w:rPr>
+        <w:t>具・インテリア特化の撮影知見」および「モール最適化ノウハウ」を強みとした新規</w:t>
+      </w:r>
+      <w:r>
+        <w:rPr>
+          <w:rFonts w:ascii="メイリオ" w:eastAsia="メイリオ" w:hAnsi="メイリオ" w:cs="メイリオ"/>
+          <w:sz w:val="19"/>
+          <w:szCs w:val="19"/>
+        </w:rPr>
+        <w:t>B</w:t>
+      </w:r>
+      <w:r>
+        <w:rPr>
+          <w:rFonts w:ascii="メイリオ" w:eastAsia="メイリオ" w:hAnsi="メイリオ" w:cs="メイリオ" w:hint="eastAsia"/>
+          <w:sz w:val="19"/>
+          <w:szCs w:val="19"/>
+        </w:rPr>
+        <w:t>2</w:t>
+      </w:r>
+      <w:r>
+        <w:rPr>
+          <w:rFonts w:ascii="メイリオ" w:eastAsia="メイリオ" w:hAnsi="メイリオ" w:cs="メイリオ"/>
+          <w:sz w:val="19"/>
+          <w:szCs w:val="19"/>
+        </w:rPr>
+        <w:t>B事業（家具撮影・LP制作受託サービス「PIXAZ」）の立ち上げに参画。同事業において年間約50ページの受託制作を牽引するなど、制作実務からマネジメント、新規事業のマネタイズまで幅広い役割を担っております。</w:t>
       </w:r>
     </w:p>
     <w:p>
       <w:pPr>
         <w:pStyle w:val="10"/>
         <w:spacing w:line="180" w:lineRule="auto"/>
+        <w:rPr>
+          <w:rFonts w:ascii="メイリオ" w:eastAsia="メイリオ" w:hAnsi="メイリオ" w:cs="メイリオ"/>
+          <w:b/>
+          <w:bCs/>
+          <w:sz w:val="19"/>
+          <w:szCs w:val="19"/>
+        </w:rPr>
+      </w:pPr>
+    </w:p>
+    <w:p>
+      <w:pPr>
+        <w:pStyle w:val="10"/>
+        <w:spacing w:line="180" w:lineRule="auto"/>
+        <w:rPr>
+          <w:rFonts w:ascii="メイリオ" w:eastAsia="メイリオ" w:hAnsi="メイリオ" w:cs="メイリオ"/>
+          <w:b/>
+          <w:bCs/>
+          <w:sz w:val="19"/>
+          <w:szCs w:val="19"/>
+        </w:rPr>
+      </w:pPr>
+      <w:r>
+        <w:rPr>
+          <w:rFonts w:ascii="メイリオ" w:eastAsia="メイリオ" w:hAnsi="メイリオ" w:cs="メイリオ"/>
+          <w:b/>
+          <w:bCs/>
+          <w:sz w:val="19"/>
+          <w:szCs w:val="19"/>
+        </w:rPr>
+        <w:t>■</w:t>
+      </w:r>
+      <w:r>
+        <w:rPr>
+          <w:rFonts w:ascii="メイリオ" w:eastAsia="メイリオ" w:hAnsi="メイリオ" w:cs="メイリオ"/>
+          <w:b/>
+          <w:bCs/>
+          <w:sz w:val="19"/>
+          <w:szCs w:val="19"/>
+          <w:lang w:val="ja-JP"/>
+        </w:rPr>
+        <w:t>活かせる経験・知識・技術</w:t>
+      </w:r>
+      <w:r>
         <w:rPr>
           <w:rFonts w:ascii="メイリオ" w:eastAsia="メイリオ" w:hAnsi="メイリオ" w:cs="メイリオ" w:hint="eastAsia"/>
           <w:b/>
           <w:bCs/>
           <w:sz w:val="19"/>
           <w:szCs w:val="19"/>
-        </w:rPr>
-      </w:pPr>
+          <w:lang w:val="ja-JP"/>
+        </w:rPr>
+        <w:t xml:space="preserve"> </w:t>
+      </w:r>
     </w:p>
     <w:p>
       <w:pPr>
@@ -218,43 +316,46 @@
         <w:spacing w:line="180" w:lineRule="auto"/>
         <w:rPr>
           <w:rFonts w:ascii="メイリオ" w:eastAsia="メイリオ" w:hAnsi="メイリオ" w:cs="メイリオ"/>
-          <w:b/>
-          <w:bCs/>
-          <w:sz w:val="19"/>
-          <w:szCs w:val="19"/>
-        </w:rPr>
-      </w:pPr>
-      <w:r>
-        <w:rPr>
-          <w:rFonts w:ascii="メイリオ" w:eastAsia="メイリオ" w:hAnsi="メイリオ" w:cs="メイリオ"/>
-          <w:b/>
-          <w:bCs/>
-          <w:sz w:val="19"/>
-          <w:szCs w:val="19"/>
-        </w:rPr>
-        <w:t>■</w:t>
-      </w:r>
-      <w:r>
-        <w:rPr>
-          <w:rFonts w:ascii="メイリオ" w:eastAsia="メイリオ" w:hAnsi="メイリオ" w:cs="メイリオ"/>
-          <w:b/>
-          <w:bCs/>
-          <w:sz w:val="19"/>
-          <w:szCs w:val="19"/>
-          <w:lang w:val="ja-JP"/>
-        </w:rPr>
-        <w:t>活かせる経験・知識・技術</w:t>
-      </w:r>
+          <w:color w:val="auto"/>
+          <w:sz w:val="19"/>
+          <w:szCs w:val="19"/>
+        </w:rPr>
+      </w:pPr>
       <w:r>
         <w:rPr>
           <w:rFonts w:ascii="メイリオ" w:eastAsia="メイリオ" w:hAnsi="メイリオ" w:cs="メイリオ" w:hint="eastAsia"/>
-          <w:b/>
-          <w:bCs/>
-          <w:sz w:val="19"/>
-          <w:szCs w:val="19"/>
-          <w:lang w:val="ja-JP"/>
-        </w:rPr>
-        <w:t xml:space="preserve"> </w:t>
+          <w:color w:val="auto"/>
+          <w:sz w:val="19"/>
+          <w:szCs w:val="19"/>
+        </w:rPr>
+        <w:t>Photoshop</w:t>
+      </w:r>
+      <w:r>
+        <w:rPr>
+          <w:rFonts w:ascii="メイリオ" w:eastAsia="メイリオ" w:hAnsi="メイリオ" w:cs="メイリオ" w:hint="eastAsia"/>
+          <w:color w:val="auto"/>
+          <w:sz w:val="19"/>
+          <w:szCs w:val="19"/>
+        </w:rPr>
+        <w:t>（イラスト・</w:t>
+      </w:r>
+      <w:r>
+        <w:rPr>
+          <w:rFonts w:ascii="メイリオ" w:eastAsia="メイリオ" w:hAnsi="メイリオ" w:cs="メイリオ" w:hint="eastAsia"/>
+          <w:color w:val="auto"/>
+          <w:sz w:val="19"/>
+          <w:szCs w:val="19"/>
+        </w:rPr>
+        <w:t>フォトレタッチ・広告等のデザイン・ウェブデザイン</w:t>
+      </w:r>
+      <w:r>
+        <w:rPr>
+          <w:rFonts w:ascii="メイリオ" w:eastAsia="メイリオ" w:hAnsi="メイリオ" w:cs="メイリオ" w:hint="eastAsia"/>
+          <w:color w:val="auto"/>
+          <w:sz w:val="19"/>
+          <w:szCs w:val="19"/>
+        </w:rPr>
+        <w:t>）</w:t>
       </w:r>
     </w:p>
     <w:p>
@@ -270,12 +371,21 @@
       </w:pPr>
       <w:r>
         <w:rPr>
+          <w:rFonts w:ascii="メイリオ" w:eastAsia="メイリオ" w:hAnsi="メイリオ" w:cs="メイリオ"/>
+          <w:color w:val="auto"/>
+          <w:sz w:val="19"/>
+          <w:szCs w:val="19"/>
+        </w:rPr>
+        <w:t>I</w:t>
+      </w:r>
+      <w:r>
+        <w:rPr>
           <w:rFonts w:ascii="メイリオ" w:eastAsia="メイリオ" w:hAnsi="メイリオ" w:cs="メイリオ" w:hint="eastAsia"/>
           <w:color w:val="auto"/>
           <w:sz w:val="19"/>
           <w:szCs w:val="19"/>
         </w:rPr>
-        <w:t>Photoshop</w:t>
+        <w:t>llustrator</w:t>
       </w:r>
       <w:r>
         <w:rPr>
@@ -284,8 +394,20 @@
           <w:sz w:val="19"/>
           <w:szCs w:val="19"/>
         </w:rPr>
-        <w:t>（イラスト・</w:t>
-      </w:r>
+        <w:t>（イラスト・広告等のデザイン・ロゴ）</w:t>
+      </w:r>
+    </w:p>
+    <w:p>
+      <w:pPr>
+        <w:pStyle w:val="10"/>
+        <w:spacing w:line="180" w:lineRule="auto"/>
+        <w:rPr>
+          <w:rFonts w:ascii="メイリオ" w:eastAsia="メイリオ" w:hAnsi="メイリオ" w:cs="メイリオ"/>
+          <w:color w:val="auto"/>
+          <w:sz w:val="19"/>
+          <w:szCs w:val="19"/>
+        </w:rPr>
+      </w:pPr>
       <w:r>
         <w:rPr>
           <w:rFonts w:ascii="メイリオ" w:eastAsia="メイリオ" w:hAnsi="メイリオ" w:cs="メイリオ" w:hint="eastAsia"/>
@@ -293,7 +415,16 @@
           <w:sz w:val="19"/>
           <w:szCs w:val="19"/>
         </w:rPr>
-        <w:t>フォトレタッチ・広告等のデザイン・ウェブデザイン</w:t>
+        <w:t>Dream</w:t>
+      </w:r>
+      <w:r>
+        <w:rPr>
+          <w:rFonts w:ascii="メイリオ" w:eastAsia="メイリオ" w:hAnsi="メイリオ" w:cs="メイリオ"/>
+          <w:color w:val="auto"/>
+          <w:sz w:val="19"/>
+          <w:szCs w:val="19"/>
+        </w:rPr>
+        <w:t>w</w:t>
       </w:r>
       <w:r>
         <w:rPr>
@@ -302,7 +433,7 @@
           <w:sz w:val="19"/>
           <w:szCs w:val="19"/>
         </w:rPr>
-        <w:t>）</w:t>
+        <w:t>eaver（ウェブデザイン）</w:t>
       </w:r>
     </w:p>
     <w:p>
@@ -323,7 +454,7 @@
           <w:sz w:val="19"/>
           <w:szCs w:val="19"/>
         </w:rPr>
-        <w:t>I</w:t>
+        <w:t>P</w:t>
       </w:r>
       <w:r>
         <w:rPr>
@@ -332,7 +463,7 @@
           <w:sz w:val="19"/>
           <w:szCs w:val="19"/>
         </w:rPr>
-        <w:t>llustrator</w:t>
+        <w:t>remiere</w:t>
       </w:r>
       <w:r>
         <w:rPr>
@@ -341,7 +472,25 @@
           <w:sz w:val="19"/>
           <w:szCs w:val="19"/>
         </w:rPr>
-        <w:t>（イラスト・広告等のデザイン・ロゴ）</w:t>
+        <w:t>（動画編集</w:t>
+      </w:r>
+      <w:r>
+        <w:rPr>
+          <w:rFonts w:ascii="メイリオ" w:eastAsia="メイリオ" w:hAnsi="メイリオ" w:cs="メイリオ" w:hint="eastAsia"/>
+          <w:color w:val="auto"/>
+          <w:sz w:val="19"/>
+          <w:szCs w:val="19"/>
+        </w:rPr>
+        <w:t>・CM制作</w:t>
+      </w:r>
+      <w:r>
+        <w:rPr>
+          <w:rFonts w:ascii="メイリオ" w:eastAsia="メイリオ" w:hAnsi="メイリオ" w:cs="メイリオ" w:hint="eastAsia"/>
+          <w:color w:val="auto"/>
+          <w:sz w:val="19"/>
+          <w:szCs w:val="19"/>
+        </w:rPr>
+        <w:t>）</w:t>
       </w:r>
     </w:p>
     <w:p>
@@ -362,16 +511,7 @@
           <w:sz w:val="19"/>
           <w:szCs w:val="19"/>
         </w:rPr>
-        <w:t>Dream</w:t>
-      </w:r>
-      <w:r>
-        <w:rPr>
-          <w:rFonts w:ascii="メイリオ" w:eastAsia="メイリオ" w:hAnsi="メイリオ" w:cs="メイリオ"/>
-          <w:color w:val="auto"/>
-          <w:sz w:val="19"/>
-          <w:szCs w:val="19"/>
-        </w:rPr>
-        <w:t>w</w:t>
+        <w:t>Aftereffect</w:t>
       </w:r>
       <w:r>
         <w:rPr>
@@ -380,7 +520,7 @@
           <w:sz w:val="19"/>
           <w:szCs w:val="19"/>
         </w:rPr>
-        <w:t>eaver（ウェブデザイン）</w:t>
+        <w:t>（アニメーション・パーティクルエフェクト等）</w:t>
       </w:r>
     </w:p>
     <w:p>
@@ -401,7 +541,7 @@
           <w:sz w:val="19"/>
           <w:szCs w:val="19"/>
         </w:rPr>
-        <w:t>P</w:t>
+        <w:t>S</w:t>
       </w:r>
       <w:r>
         <w:rPr>
@@ -410,7 +550,46 @@
           <w:sz w:val="19"/>
           <w:szCs w:val="19"/>
         </w:rPr>
-        <w:t>remiere</w:t>
+        <w:t>hade（建物外観図）</w:t>
+      </w:r>
+    </w:p>
+    <w:p>
+      <w:pPr>
+        <w:pStyle w:val="10"/>
+        <w:spacing w:line="180" w:lineRule="auto"/>
+        <w:rPr>
+          <w:rFonts w:ascii="メイリオ" w:eastAsia="メイリオ" w:hAnsi="メイリオ" w:cs="メイリオ"/>
+          <w:color w:val="auto"/>
+          <w:sz w:val="19"/>
+          <w:szCs w:val="19"/>
+        </w:rPr>
+      </w:pPr>
+      <w:r>
+        <w:rPr>
+          <w:rFonts w:ascii="Segoe UI Symbol" w:eastAsia="メイリオ" w:hAnsi="Segoe UI Symbol" w:cs="Segoe UI Symbol" w:hint="eastAsia"/>
+          <w:color w:val="auto"/>
+          <w:sz w:val="19"/>
+          <w:szCs w:val="19"/>
+        </w:rPr>
+        <w:t>C</w:t>
+      </w:r>
+      <w:r>
+        <w:rPr>
+          <w:rFonts w:ascii="Segoe UI Symbol" w:eastAsia="メイリオ" w:hAnsi="Segoe UI Symbol" w:cs="Segoe UI Symbol"/>
+          <w:color w:val="auto"/>
+          <w:sz w:val="19"/>
+          <w:szCs w:val="19"/>
+        </w:rPr>
+        <w:t>LIP</w:t>
+      </w:r>
+      <w:r>
+        <w:rPr>
+          <w:rFonts w:ascii="Segoe UI Symbol" w:eastAsia="メイリオ" w:hAnsi="Segoe UI Symbol" w:cs="Segoe UI Symbol" w:hint="eastAsia"/>
+          <w:color w:val="auto"/>
+          <w:sz w:val="19"/>
+          <w:szCs w:val="19"/>
+        </w:rPr>
+        <w:t xml:space="preserve"> </w:t>
       </w:r>
       <w:r>
         <w:rPr>
@@ -419,8 +598,20 @@
           <w:sz w:val="19"/>
           <w:szCs w:val="19"/>
         </w:rPr>
-        <w:t>（動画編集</w:t>
-      </w:r>
+        <w:t>STUDIO（イラスト・漫画制作）</w:t>
+      </w:r>
+    </w:p>
+    <w:p>
+      <w:pPr>
+        <w:pStyle w:val="10"/>
+        <w:spacing w:line="180" w:lineRule="auto"/>
+        <w:rPr>
+          <w:rFonts w:ascii="メイリオ" w:eastAsia="メイリオ" w:hAnsi="メイリオ" w:cs="メイリオ"/>
+          <w:color w:val="auto"/>
+          <w:sz w:val="19"/>
+          <w:szCs w:val="19"/>
+        </w:rPr>
+      </w:pPr>
       <w:r>
         <w:rPr>
           <w:rFonts w:ascii="メイリオ" w:eastAsia="メイリオ" w:hAnsi="メイリオ" w:cs="メイリオ" w:hint="eastAsia"/>
@@ -428,16 +619,7 @@
           <w:sz w:val="19"/>
           <w:szCs w:val="19"/>
         </w:rPr>
-        <w:t>・CM制作</w:t>
-      </w:r>
-      <w:r>
-        <w:rPr>
-          <w:rFonts w:ascii="メイリオ" w:eastAsia="メイリオ" w:hAnsi="メイリオ" w:cs="メイリオ" w:hint="eastAsia"/>
-          <w:color w:val="auto"/>
-          <w:sz w:val="19"/>
-          <w:szCs w:val="19"/>
-        </w:rPr>
-        <w:t>）</w:t>
+        <w:t>HTML（ウェブデザイン）</w:t>
       </w:r>
     </w:p>
     <w:p>
@@ -446,135 +628,6 @@
         <w:spacing w:line="180" w:lineRule="auto"/>
         <w:rPr>
           <w:rFonts w:ascii="メイリオ" w:eastAsia="メイリオ" w:hAnsi="メイリオ" w:cs="メイリオ"/>
-          <w:color w:val="auto"/>
-          <w:sz w:val="19"/>
-          <w:szCs w:val="19"/>
-        </w:rPr>
-      </w:pPr>
-      <w:r>
-        <w:rPr>
-          <w:rFonts w:ascii="メイリオ" w:eastAsia="メイリオ" w:hAnsi="メイリオ" w:cs="メイリオ" w:hint="eastAsia"/>
-          <w:color w:val="auto"/>
-          <w:sz w:val="19"/>
-          <w:szCs w:val="19"/>
-        </w:rPr>
-        <w:t>Aftereffect</w:t>
-      </w:r>
-      <w:r>
-        <w:rPr>
-          <w:rFonts w:ascii="メイリオ" w:eastAsia="メイリオ" w:hAnsi="メイリオ" w:cs="メイリオ" w:hint="eastAsia"/>
-          <w:color w:val="auto"/>
-          <w:sz w:val="19"/>
-          <w:szCs w:val="19"/>
-        </w:rPr>
-        <w:t>（アニメーション・パーティクルエフェクト等）</w:t>
-      </w:r>
-    </w:p>
-    <w:p>
-      <w:pPr>
-        <w:pStyle w:val="10"/>
-        <w:spacing w:line="180" w:lineRule="auto"/>
-        <w:rPr>
-          <w:rFonts w:ascii="メイリオ" w:eastAsia="メイリオ" w:hAnsi="メイリオ" w:cs="メイリオ"/>
-          <w:color w:val="auto"/>
-          <w:sz w:val="19"/>
-          <w:szCs w:val="19"/>
-        </w:rPr>
-      </w:pPr>
-      <w:r>
-        <w:rPr>
-          <w:rFonts w:ascii="メイリオ" w:eastAsia="メイリオ" w:hAnsi="メイリオ" w:cs="メイリオ"/>
-          <w:color w:val="auto"/>
-          <w:sz w:val="19"/>
-          <w:szCs w:val="19"/>
-        </w:rPr>
-        <w:t>S</w:t>
-      </w:r>
-      <w:r>
-        <w:rPr>
-          <w:rFonts w:ascii="メイリオ" w:eastAsia="メイリオ" w:hAnsi="メイリオ" w:cs="メイリオ" w:hint="eastAsia"/>
-          <w:color w:val="auto"/>
-          <w:sz w:val="19"/>
-          <w:szCs w:val="19"/>
-        </w:rPr>
-        <w:t>hade（建物外観図）</w:t>
-      </w:r>
-    </w:p>
-    <w:p>
-      <w:pPr>
-        <w:pStyle w:val="10"/>
-        <w:spacing w:line="180" w:lineRule="auto"/>
-        <w:rPr>
-          <w:rFonts w:ascii="メイリオ" w:eastAsia="メイリオ" w:hAnsi="メイリオ" w:cs="メイリオ"/>
-          <w:color w:val="auto"/>
-          <w:sz w:val="19"/>
-          <w:szCs w:val="19"/>
-        </w:rPr>
-      </w:pPr>
-      <w:r>
-        <w:rPr>
-          <w:rFonts w:ascii="Segoe UI Symbol" w:eastAsia="メイリオ" w:hAnsi="Segoe UI Symbol" w:cs="Segoe UI Symbol" w:hint="eastAsia"/>
-          <w:color w:val="auto"/>
-          <w:sz w:val="19"/>
-          <w:szCs w:val="19"/>
-        </w:rPr>
-        <w:t>C</w:t>
-      </w:r>
-      <w:r>
-        <w:rPr>
-          <w:rFonts w:ascii="Segoe UI Symbol" w:eastAsia="メイリオ" w:hAnsi="Segoe UI Symbol" w:cs="Segoe UI Symbol"/>
-          <w:color w:val="auto"/>
-          <w:sz w:val="19"/>
-          <w:szCs w:val="19"/>
-        </w:rPr>
-        <w:t>LIP</w:t>
-      </w:r>
-      <w:r>
-        <w:rPr>
-          <w:rFonts w:ascii="Segoe UI Symbol" w:eastAsia="メイリオ" w:hAnsi="Segoe UI Symbol" w:cs="Segoe UI Symbol" w:hint="eastAsia"/>
-          <w:color w:val="auto"/>
-          <w:sz w:val="19"/>
-          <w:szCs w:val="19"/>
-        </w:rPr>
-        <w:t xml:space="preserve"> </w:t>
-      </w:r>
-      <w:r>
-        <w:rPr>
-          <w:rFonts w:ascii="メイリオ" w:eastAsia="メイリオ" w:hAnsi="メイリオ" w:cs="メイリオ" w:hint="eastAsia"/>
-          <w:color w:val="auto"/>
-          <w:sz w:val="19"/>
-          <w:szCs w:val="19"/>
-        </w:rPr>
-        <w:t>STUDIO（イラスト・漫画制作）</w:t>
-      </w:r>
-    </w:p>
-    <w:p>
-      <w:pPr>
-        <w:pStyle w:val="10"/>
-        <w:spacing w:line="180" w:lineRule="auto"/>
-        <w:rPr>
-          <w:rFonts w:ascii="メイリオ" w:eastAsia="メイリオ" w:hAnsi="メイリオ" w:cs="メイリオ"/>
-          <w:color w:val="auto"/>
-          <w:sz w:val="19"/>
-          <w:szCs w:val="19"/>
-        </w:rPr>
-      </w:pPr>
-      <w:r>
-        <w:rPr>
-          <w:rFonts w:ascii="メイリオ" w:eastAsia="メイリオ" w:hAnsi="メイリオ" w:cs="メイリオ" w:hint="eastAsia"/>
-          <w:color w:val="auto"/>
-          <w:sz w:val="19"/>
-          <w:szCs w:val="19"/>
-        </w:rPr>
-        <w:t>HTML（ウェブデザイン）</w:t>
-      </w:r>
-    </w:p>
-    <w:p>
-      <w:pPr>
-        <w:pStyle w:val="10"/>
-        <w:spacing w:line="180" w:lineRule="auto"/>
-        <w:rPr>
-          <w:rFonts w:ascii="メイリオ" w:eastAsia="メイリオ" w:hAnsi="メイリオ" w:cs="メイリオ" w:hint="eastAsia"/>
           <w:color w:val="auto"/>
           <w:sz w:val="19"/>
           <w:szCs w:val="19"/>
@@ -680,39 +733,7 @@
           <w:sz w:val="19"/>
           <w:szCs w:val="19"/>
         </w:rPr>
-        <w:t>201</w:t>
-      </w:r>
-      <w:r>
-        <w:rPr>
-          <w:rFonts w:ascii="メイリオ" w:eastAsia="メイリオ" w:hAnsi="メイリオ" w:cs="メイリオ" w:hint="eastAsia"/>
-          <w:sz w:val="19"/>
-          <w:szCs w:val="19"/>
-        </w:rPr>
-        <w:t>9</w:t>
-      </w:r>
-      <w:r>
-        <w:rPr>
-          <w:rFonts w:ascii="メイリオ" w:eastAsia="メイリオ" w:hAnsi="メイリオ" w:cs="メイリオ" w:hint="eastAsia"/>
-          <w:sz w:val="19"/>
-          <w:szCs w:val="19"/>
-        </w:rPr>
-        <w:t>年</w:t>
-      </w:r>
-      <w:r>
-        <w:rPr>
-          <w:rFonts w:ascii="メイリオ" w:eastAsia="メイリオ" w:hAnsi="メイリオ" w:cs="メイリオ" w:hint="eastAsia"/>
-          <w:sz w:val="19"/>
-          <w:szCs w:val="19"/>
-        </w:rPr>
-        <w:t>8</w:t>
-      </w:r>
-      <w:r>
-        <w:rPr>
-          <w:rFonts w:ascii="メイリオ" w:eastAsia="メイリオ" w:hAnsi="メイリオ" w:cs="メイリオ" w:hint="eastAsia"/>
-          <w:sz w:val="19"/>
-          <w:szCs w:val="19"/>
-        </w:rPr>
-        <w:t>月～在籍中</w:t>
+        <w:t>2019年8月～在籍中</w:t>
       </w:r>
     </w:p>
     <w:p>
@@ -802,7 +823,7 @@
         <w:spacing w:line="180" w:lineRule="auto"/>
         <w:ind w:left="193"/>
         <w:rPr>
-          <w:rFonts w:ascii="メイリオ" w:eastAsia="メイリオ" w:hAnsi="メイリオ" w:cs="メイリオ" w:hint="eastAsia"/>
+          <w:rFonts w:ascii="メイリオ" w:eastAsia="メイリオ" w:hAnsi="メイリオ" w:cs="メイリオ"/>
           <w:sz w:val="19"/>
           <w:szCs w:val="19"/>
         </w:rPr>
@@ -906,56 +927,33 @@
             </w:tcMar>
           </w:tcPr>
           <w:p>
-            <w:r/>
-            <w:r>
-              <w:rPr>
-                <w:b/>
-              </w:rPr>
-              <w:t>ECサイト向け商品ページ制作ディレクション</w:t>
-              <w:br/>
-            </w:r>
-            <w:r>
-              <w:t>展開モール：楽天市場、Yahoo!ショッピング、au PAY マーケット、Amazon</w:t>
-              <w:br/>
-              <w:t>取扱商材：家具、インテリア雑貨</w:t>
-              <w:br/>
-              <w:t>管理規模：商品ページ総数 4,000～6,000ページ超</w:t>
-              <w:br/>
-              <w:t>業務詳細：新商品のページ制作（構成案作成、デザイン指示）および既存ページの改修（CV改善SEO対策離脱抑制の配置最適化）。</w:t>
-              <w:br/>
-              <w:t>実績：い草屋さんこたつ屋さん等の自社系列店舗全体で、こたつカテゴリのシェア20%、い草カテゴリのシェア30%超を獲得維持する原動力として貢献。</w:t>
-              <w:br/>
-              <w:br/>
-            </w:r>
-          </w:p>
-          <w:p>
-            <w:r>
-              <w:rPr>
-                <w:b/>
-              </w:rPr>
-              <w:t>制作チームのマネジメント</w:t>
-              <w:br/>
-            </w:r>
-            <w:r>
-              <w:t>マネジメント規模：5名</w:t>
-              <w:br/>
-              <w:t>業務詳細：年間150～200ページ程度を制作するチームの進行管理、タスク割り当て、クオリティコントロールを実施。メンバーのスキル育成および業務効率化を推進。</w:t>
-              <w:br/>
-              <w:br/>
-            </w:r>
-          </w:p>
-          <w:p>
-            <w:r>
-              <w:rPr>
-                <w:b/>
-              </w:rPr>
-              <w:t>新規B2B事業「PIXAZ（ピクサズ）」の立ち上げ推進（2024年～現在）</w:t>
-              <w:br/>
-            </w:r>
-            <w:r>
-              <w:t>事業概要：家具業界向け従量課金型の撮影およびLP制作受託サービス</w:t>
-              <w:br/>
-              <w:t>業務詳細および実績：自社EC運営で培った「CVRを高める見せ方」「大型家具の実務（搬入組立など）」のノウハウを強みとした、新規B2Bサービスの立ち上げメンバーとして参画。クライアントへのヒアリング、構成案（絵コンテ）の作成、撮影ディレクション、LP制作までをワンストップで担当。楽天市場Yahoo!ショッピング等のモール特性に最適化した画像配置や訴求内容を他社へ提供し、年間約50ページの受託制作を実行。</w:t>
+            <w:pPr>
+              <w:pStyle w:val="10"/>
+              <w:spacing w:line="180" w:lineRule="auto"/>
+              <w:rPr>
+                <w:rFonts w:ascii="メイリオ" w:eastAsia="メイリオ" w:hAnsi="メイリオ" w:cs="メイリオ"/>
+                <w:sz w:val="19"/>
+                <w:szCs w:val="19"/>
+                <w:lang w:val="ja-JP"/>
+              </w:rPr>
+            </w:pPr>
+            <w:r>
+              <w:rPr>
+                <w:rFonts w:ascii="メイリオ" w:eastAsia="メイリオ" w:hAnsi="メイリオ" w:cs="メイリオ" w:hint="eastAsia"/>
+                <w:sz w:val="19"/>
+                <w:szCs w:val="19"/>
+                <w:lang w:val="ja-JP"/>
+              </w:rPr>
+              <w:t>主な職務</w:t>
+            </w:r>
+            <w:r>
+              <w:rPr>
+                <w:rFonts w:ascii="メイリオ" w:eastAsia="メイリオ" w:hAnsi="メイリオ" w:cs="メイリオ"/>
+                <w:sz w:val="19"/>
+                <w:szCs w:val="19"/>
+                <w:lang w:val="ja-JP"/>
+              </w:rPr>
+              <w:t>内容</w:t>
             </w:r>
           </w:p>
         </w:tc>
@@ -1159,29 +1157,29 @@
               <w:pStyle w:val="10"/>
               <w:spacing w:line="180" w:lineRule="auto"/>
               <w:rPr>
-                <w:rFonts w:ascii="メイリオ" w:eastAsia="メイリオ" w:hAnsi="メイリオ" w:cs="メイリオ" w:hint="eastAsia"/>
-                <w:sz w:val="19"/>
-                <w:szCs w:val="19"/>
-              </w:rPr>
-            </w:pPr>
-          </w:p>
-          <w:p>
-            <w:pPr>
-              <w:pStyle w:val="10"/>
-              <w:spacing w:line="180" w:lineRule="auto"/>
-              <w:rPr>
-                <w:rFonts w:ascii="メイリオ" w:eastAsia="メイリオ" w:hAnsi="メイリオ" w:cs="メイリオ"/>
-                <w:sz w:val="19"/>
-                <w:szCs w:val="19"/>
-              </w:rPr>
-            </w:pPr>
-          </w:p>
-          <w:p>
-            <w:pPr>
-              <w:pStyle w:val="10"/>
-              <w:spacing w:line="180" w:lineRule="auto"/>
-              <w:rPr>
-                <w:rFonts w:ascii="メイリオ" w:eastAsia="メイリオ" w:hAnsi="メイリオ" w:cs="メイリオ" w:hint="eastAsia"/>
+                <w:rFonts w:ascii="メイリオ" w:eastAsia="メイリオ" w:hAnsi="メイリオ" w:cs="メイリオ"/>
+                <w:sz w:val="19"/>
+                <w:szCs w:val="19"/>
+              </w:rPr>
+            </w:pPr>
+          </w:p>
+          <w:p>
+            <w:pPr>
+              <w:pStyle w:val="10"/>
+              <w:spacing w:line="180" w:lineRule="auto"/>
+              <w:rPr>
+                <w:rFonts w:ascii="メイリオ" w:eastAsia="メイリオ" w:hAnsi="メイリオ" w:cs="メイリオ"/>
+                <w:sz w:val="19"/>
+                <w:szCs w:val="19"/>
+              </w:rPr>
+            </w:pPr>
+          </w:p>
+          <w:p>
+            <w:pPr>
+              <w:pStyle w:val="10"/>
+              <w:spacing w:line="180" w:lineRule="auto"/>
+              <w:rPr>
+                <w:rFonts w:ascii="メイリオ" w:eastAsia="メイリオ" w:hAnsi="メイリオ" w:cs="メイリオ"/>
                 <w:sz w:val="19"/>
                 <w:szCs w:val="19"/>
               </w:rPr>
@@ -1230,7 +1228,7 @@
               <w:pStyle w:val="10"/>
               <w:spacing w:line="180" w:lineRule="auto"/>
               <w:rPr>
-                <w:rFonts w:ascii="メイリオ" w:eastAsia="メイリオ" w:hAnsi="メイリオ" w:cs="メイリオ" w:hint="eastAsia"/>
+                <w:rFonts w:ascii="メイリオ" w:eastAsia="メイリオ" w:hAnsi="メイリオ" w:cs="メイリオ"/>
                 <w:sz w:val="19"/>
                 <w:szCs w:val="19"/>
               </w:rPr>
@@ -1252,7 +1250,7 @@
               <w:pStyle w:val="10"/>
               <w:spacing w:line="180" w:lineRule="auto"/>
               <w:rPr>
-                <w:rFonts w:ascii="メイリオ" w:eastAsia="メイリオ" w:hAnsi="メイリオ" w:cs="メイリオ" w:hint="eastAsia"/>
+                <w:rFonts w:ascii="メイリオ" w:eastAsia="メイリオ" w:hAnsi="メイリオ" w:cs="メイリオ"/>
                 <w:kern w:val="0"/>
                 <w:sz w:val="19"/>
                 <w:szCs w:val="19"/>
@@ -1448,7 +1446,7 @@
               <w:pStyle w:val="10"/>
               <w:spacing w:line="180" w:lineRule="auto"/>
               <w:rPr>
-                <w:rFonts w:ascii="メイリオ" w:eastAsia="メイリオ" w:hAnsi="メイリオ" w:cs="メイリオ" w:hint="eastAsia"/>
+                <w:rFonts w:ascii="メイリオ" w:eastAsia="メイリオ" w:hAnsi="メイリオ" w:cs="メイリオ"/>
                 <w:kern w:val="0"/>
                 <w:sz w:val="19"/>
                 <w:szCs w:val="19"/>
@@ -1532,7 +1530,7 @@
               <w:pStyle w:val="10"/>
               <w:spacing w:line="180" w:lineRule="auto"/>
               <w:rPr>
-                <w:rFonts w:ascii="メイリオ" w:eastAsia="メイリオ" w:hAnsi="メイリオ" w:cs="メイリオ" w:hint="eastAsia"/>
+                <w:rFonts w:ascii="メイリオ" w:eastAsia="メイリオ" w:hAnsi="メイリオ" w:cs="メイリオ"/>
                 <w:kern w:val="0"/>
                 <w:sz w:val="19"/>
                 <w:szCs w:val="19"/>
@@ -1583,7 +1581,7 @@
               <w:pStyle w:val="10"/>
               <w:spacing w:line="180" w:lineRule="auto"/>
               <w:rPr>
-                <w:rFonts w:ascii="メイリオ" w:eastAsia="メイリオ" w:hAnsi="メイリオ" w:cs="メイリオ" w:hint="eastAsia"/>
+                <w:rFonts w:ascii="メイリオ" w:eastAsia="メイリオ" w:hAnsi="メイリオ" w:cs="メイリオ"/>
                 <w:kern w:val="0"/>
                 <w:sz w:val="19"/>
                 <w:szCs w:val="19"/>
@@ -1712,7 +1710,7 @@
               <w:pStyle w:val="10"/>
               <w:spacing w:line="180" w:lineRule="auto"/>
               <w:rPr>
-                <w:rFonts w:ascii="メイリオ" w:eastAsia="メイリオ" w:hAnsi="メイリオ" w:cs="メイリオ" w:hint="eastAsia"/>
+                <w:rFonts w:ascii="メイリオ" w:eastAsia="メイリオ" w:hAnsi="メイリオ" w:cs="メイリオ"/>
                 <w:kern w:val="0"/>
                 <w:sz w:val="19"/>
                 <w:szCs w:val="19"/>
@@ -1759,7 +1757,7 @@
         <w:pStyle w:val="10"/>
         <w:spacing w:line="180" w:lineRule="auto"/>
         <w:rPr>
-          <w:rFonts w:ascii="メイリオ" w:eastAsia="メイリオ" w:hAnsi="メイリオ" w:cs="メイリオ" w:hint="eastAsia"/>
+          <w:rFonts w:ascii="メイリオ" w:eastAsia="メイリオ" w:hAnsi="メイリオ" w:cs="メイリオ"/>
           <w:b/>
           <w:bCs/>
           <w:sz w:val="19"/>
@@ -2983,7 +2981,7 @@
               <w:pStyle w:val="10"/>
               <w:spacing w:line="180" w:lineRule="auto"/>
               <w:rPr>
-                <w:rFonts w:ascii="メイリオ" w:eastAsia="メイリオ" w:hAnsi="メイリオ" w:cs="メイリオ" w:hint="eastAsia"/>
+                <w:rFonts w:ascii="メイリオ" w:eastAsia="メイリオ" w:hAnsi="メイリオ" w:cs="メイリオ"/>
                 <w:kern w:val="0"/>
                 <w:sz w:val="19"/>
                 <w:szCs w:val="19"/>
@@ -3514,7 +3512,7 @@
               <w:pStyle w:val="10"/>
               <w:spacing w:line="180" w:lineRule="auto"/>
               <w:rPr>
-                <w:rFonts w:ascii="メイリオ" w:eastAsia="メイリオ" w:hAnsi="メイリオ" w:cs="メイリオ" w:hint="eastAsia"/>
+                <w:rFonts w:ascii="メイリオ" w:eastAsia="メイリオ" w:hAnsi="メイリオ" w:cs="メイリオ"/>
                 <w:kern w:val="0"/>
                 <w:sz w:val="19"/>
                 <w:szCs w:val="19"/>
@@ -3610,7 +3608,7 @@
               <w:pStyle w:val="10"/>
               <w:spacing w:line="180" w:lineRule="auto"/>
               <w:rPr>
-                <w:rFonts w:ascii="メイリオ" w:eastAsia="メイリオ" w:hAnsi="メイリオ" w:cs="メイリオ" w:hint="eastAsia"/>
+                <w:rFonts w:ascii="メイリオ" w:eastAsia="メイリオ" w:hAnsi="メイリオ" w:cs="メイリオ"/>
                 <w:kern w:val="0"/>
                 <w:sz w:val="19"/>
                 <w:szCs w:val="19"/>
@@ -3697,7 +3695,7 @@
               <w:pStyle w:val="10"/>
               <w:spacing w:line="180" w:lineRule="auto"/>
               <w:rPr>
-                <w:rFonts w:ascii="メイリオ" w:eastAsia="メイリオ" w:hAnsi="メイリオ" w:cs="メイリオ" w:hint="eastAsia"/>
+                <w:rFonts w:ascii="メイリオ" w:eastAsia="メイリオ" w:hAnsi="メイリオ" w:cs="メイリオ"/>
                 <w:kern w:val="0"/>
                 <w:sz w:val="19"/>
                 <w:szCs w:val="19"/>
@@ -3739,7 +3737,7 @@
               <w:pStyle w:val="10"/>
               <w:spacing w:line="180" w:lineRule="auto"/>
               <w:rPr>
-                <w:rFonts w:ascii="メイリオ" w:eastAsia="メイリオ" w:hAnsi="メイリオ" w:cs="メイリオ" w:hint="eastAsia"/>
+                <w:rFonts w:ascii="メイリオ" w:eastAsia="メイリオ" w:hAnsi="メイリオ" w:cs="メイリオ"/>
                 <w:kern w:val="0"/>
                 <w:sz w:val="19"/>
                 <w:szCs w:val="19"/>
@@ -3897,7 +3895,7 @@
               <w:pStyle w:val="10"/>
               <w:spacing w:line="180" w:lineRule="auto"/>
               <w:rPr>
-                <w:rFonts w:ascii="メイリオ" w:eastAsia="メイリオ" w:hAnsi="メイリオ" w:cs="メイリオ" w:hint="eastAsia"/>
+                <w:rFonts w:ascii="メイリオ" w:eastAsia="メイリオ" w:hAnsi="メイリオ" w:cs="メイリオ"/>
                 <w:kern w:val="0"/>
                 <w:sz w:val="19"/>
                 <w:szCs w:val="19"/>
@@ -5205,17 +5203,29 @@
           <w:rFonts w:ascii="メイリオ" w:eastAsia="メイリオ" w:hAnsi="メイリオ" w:cs="メイリオ"/>
           <w:sz w:val="19"/>
           <w:szCs w:val="19"/>
-        </w:rPr>
-      </w:pPr>
-      <w:r>
-        <w:rPr>
-          <w:rFonts w:ascii="メイリオ" w:eastAsia="メイリオ" w:hAnsi="メイリオ" w:cs="メイリオ"/>
-          <w:sz w:val="19"/>
-          <w:szCs w:val="19"/>
           <w:lang w:val="ja-JP"/>
         </w:rPr>
+      </w:pPr>
+      <w:r>
+        <w:rPr>
+          <w:rFonts w:ascii="メイリオ" w:eastAsia="メイリオ" w:hAnsi="メイリオ" w:cs="メイリオ"/>
+          <w:sz w:val="19"/>
+          <w:szCs w:val="19"/>
+          <w:lang w:val="ja-JP"/>
+        </w:rPr>
         <w:t xml:space="preserve">　</w:t>
       </w:r>
+    </w:p>
+    <w:p>
+      <w:pPr>
+        <w:pStyle w:val="10"/>
+        <w:spacing w:line="180" w:lineRule="auto"/>
+        <w:rPr>
+          <w:rFonts w:ascii="メイリオ" w:eastAsia="メイリオ" w:hAnsi="メイリオ" w:cs="メイリオ"/>
+          <w:sz w:val="19"/>
+          <w:szCs w:val="19"/>
+        </w:rPr>
+      </w:pPr>
       <w:r>
         <w:rPr>
           <w:rFonts w:ascii="メイリオ" w:eastAsia="メイリオ" w:hAnsi="メイリオ" w:cs="メイリオ"/>
@@ -5685,6 +5695,17 @@
         <w:pStyle w:val="10"/>
         <w:spacing w:line="180" w:lineRule="auto"/>
         <w:rPr>
+          <w:rFonts w:ascii="メイリオ" w:eastAsia="メイリオ" w:hAnsi="メイリオ" w:cs="メイリオ" w:hint="eastAsia"/>
+          <w:sz w:val="19"/>
+          <w:szCs w:val="19"/>
+        </w:rPr>
+      </w:pPr>
+    </w:p>
+    <w:p>
+      <w:pPr>
+        <w:pStyle w:val="10"/>
+        <w:spacing w:line="180" w:lineRule="auto"/>
+        <w:rPr>
           <w:rFonts w:ascii="メイリオ" w:eastAsia="メイリオ" w:hAnsi="メイリオ" w:cs="メイリオ"/>
           <w:b/>
           <w:bCs/>
@@ -5700,6 +5721,7 @@
           <w:sz w:val="19"/>
           <w:szCs w:val="19"/>
         </w:rPr>
+        <w:lastRenderedPageBreak/>
         <w:t>■</w:t>
       </w:r>
       <w:r>
@@ -5727,19 +5749,85 @@
         </w:rPr>
       </w:pPr>
       <w:r>
+        <w:rPr>
+          <w:rFonts w:ascii="メイリオ" w:eastAsia="メイリオ" w:hAnsi="メイリオ" w:cs="メイリオ" w:hint="eastAsia"/>
+          <w:color w:val="auto"/>
+          <w:sz w:val="19"/>
+          <w:szCs w:val="19"/>
+        </w:rPr>
         <w:t>普通自動車免許(第一種)</w:t>
+      </w:r>
+      <w:r>
+        <w:rPr>
+          <w:rFonts w:ascii="メイリオ" w:eastAsia="メイリオ" w:hAnsi="メイリオ" w:cs="メイリオ" w:hint="eastAsia"/>
+          <w:color w:val="auto"/>
+          <w:sz w:val="19"/>
+          <w:szCs w:val="19"/>
+        </w:rPr>
         <w:br/>
         <w:t>宅地建物取引士</w:t>
-        <w:br/>
-        <w:t>グロービス経営大学院 クリティカル・シンキング 修了（単科履修 / 2021年7月）</w:t>
-        <w:br/>
-        <w:t>グロービス経営大学院 マーケティング・経営戦略基礎 修了（単科履修 / 2022年1月）</w:t>
       </w:r>
     </w:p>
     <w:p>
       <w:pPr>
         <w:pStyle w:val="10"/>
         <w:spacing w:line="180" w:lineRule="auto"/>
+        <w:ind w:leftChars="100" w:left="240"/>
+        <w:rPr>
+          <w:rFonts w:ascii="メイリオ" w:eastAsia="メイリオ" w:hAnsi="メイリオ" w:cs="メイリオ"/>
+          <w:sz w:val="19"/>
+          <w:szCs w:val="19"/>
+        </w:rPr>
+      </w:pPr>
+      <w:r>
+        <w:rPr>
+          <w:rFonts w:ascii="メイリオ" w:eastAsia="メイリオ" w:hAnsi="メイリオ" w:cs="メイリオ" w:hint="eastAsia"/>
+          <w:sz w:val="19"/>
+          <w:szCs w:val="19"/>
+        </w:rPr>
+        <w:t>グロービス経営大学院</w:t>
+      </w:r>
+      <w:r>
+        <w:rPr>
+          <w:rFonts w:ascii="メイリオ" w:eastAsia="メイリオ" w:hAnsi="メイリオ" w:cs="メイリオ"/>
+          <w:sz w:val="19"/>
+          <w:szCs w:val="19"/>
+        </w:rPr>
+        <w:t xml:space="preserve"> クリティカル・シンキング 修了（単科履修 / 2021年7月）</w:t>
+      </w:r>
+    </w:p>
+    <w:p>
+      <w:pPr>
+        <w:pStyle w:val="10"/>
+        <w:spacing w:line="180" w:lineRule="auto"/>
+        <w:ind w:leftChars="100" w:left="240"/>
+        <w:rPr>
+          <w:rFonts w:ascii="メイリオ" w:eastAsia="メイリオ" w:hAnsi="メイリオ" w:cs="メイリオ"/>
+          <w:sz w:val="19"/>
+          <w:szCs w:val="19"/>
+        </w:rPr>
+      </w:pPr>
+      <w:r>
+        <w:rPr>
+          <w:rFonts w:ascii="メイリオ" w:eastAsia="メイリオ" w:hAnsi="メイリオ" w:cs="メイリオ" w:hint="eastAsia"/>
+          <w:sz w:val="19"/>
+          <w:szCs w:val="19"/>
+        </w:rPr>
+        <w:t>グロービス経営大学院</w:t>
+      </w:r>
+      <w:r>
+        <w:rPr>
+          <w:rFonts w:ascii="メイリオ" w:eastAsia="メイリオ" w:hAnsi="メイリオ" w:cs="メイリオ"/>
+          <w:sz w:val="19"/>
+          <w:szCs w:val="19"/>
+        </w:rPr>
+        <w:t xml:space="preserve"> マーケティング・経営戦略基礎 修了（単科履修 / 2022年1月）</w:t>
+      </w:r>
+    </w:p>
+    <w:p>
+      <w:pPr>
+        <w:pStyle w:val="10"/>
+        <w:spacing w:line="180" w:lineRule="auto"/>
         <w:rPr>
           <w:rFonts w:ascii="メイリオ" w:eastAsia="メイリオ" w:hAnsi="メイリオ" w:cs="メイリオ"/>
           <w:b/>
@@ -5748,21 +5836,6 @@
           <w:szCs w:val="19"/>
         </w:rPr>
       </w:pPr>
-      <w:r/>
-    </w:p>
-    <w:p>
-      <w:pPr>
-        <w:pStyle w:val="10"/>
-        <w:spacing w:line="180" w:lineRule="auto"/>
-        <w:rPr>
-          <w:rFonts w:ascii="メイリオ" w:eastAsia="メイリオ" w:hAnsi="メイリオ" w:cs="メイリオ"/>
-          <w:b/>
-          <w:bCs/>
-          <w:sz w:val="19"/>
-          <w:szCs w:val="19"/>
-        </w:rPr>
-      </w:pPr>
-      <w:r/>
     </w:p>
     <w:p>
       <w:pPr>
@@ -5802,7 +5875,6 @@
       <w:pPr>
         <w:pStyle w:val="10"/>
         <w:spacing w:line="180" w:lineRule="auto"/>
-        <w:ind w:left="193"/>
         <w:rPr>
           <w:rFonts w:ascii="メイリオ" w:eastAsia="メイリオ" w:hAnsi="メイリオ" w:cs="メイリオ"/>
           <w:color w:val="auto"/>
@@ -5811,24 +5883,22 @@
         </w:rPr>
       </w:pPr>
       <w:r>
-        <w:t>【1. ECモールにおける「売上を作る」ディレクション能力】</w:t>
-        <w:br/>
-        <w:t>家具・インテリア商材を中心としたEC事業において、楽天市場やYahoo!ショッピング等での多店舗展開を牽引してまいりました。「第一印象を決めるサムネイル画像」「商材のスケール感を伝える構成」「離脱を防ぐ画像配置」など、主要モールの特性に最適化したページ設計を得意としております。結果として、楽天市場における「こたつ」カテゴリシェア約20%、「い草商品」カテゴリシェア30%超という圧倒的な実績の獲得と維持に貢献いたしました。</w:t>
-        <w:br/>
-        <w:br/>
-        <w:t>【2. プレイングマネージャーとしての組織牽引力】</w:t>
-        <w:br/>
-        <w:t>年間150～200ページの新商品ページ制作を行う5名体制のチームマネジメントを経験しました。進行管理やクオリティコントロールはもちろん、メンバー育成やEvernote等を活用した業務フローの改善にも取り組み、制作スピードと品質の両立を担保する組織作りを推進してまいりました。</w:t>
-        <w:br/>
-        <w:br/>
-        <w:t>【3. ゼロからの新規B2Bスキームの構築プロセス経験】</w:t>
-        <w:br/>
-        <w:t>EC運営で培った「家具特化の撮影知見」と「CVRを高めるLP制作ノウハウ」を強みとした、新規B2B事業（家具撮影・LP制作受託サービス「PIXAZ」）の立ち上げ実務に第一線で参画しました。事業のスキーム構築から始まり、クライアントの課題抽出（ヒアリング）、構成・絵コンテによる提案、撮影からLP納品に至るまでの「一気通貫した受託制作フロー」をゼロから整備・確立し、年間約50ページの受託案件を納期遅れなく完遂いたしました。事業立ち上げ期特有の「サービス設計から運用までの全工程」を泥臭く実行し形にする実行力を有しております。</w:t>
-        <w:br/>
-        <w:br/>
-        <w:t>【4. 多分野の知見を掛け合わせた課題解決力】</w:t>
-        <w:br/>
-        <w:t>グラフィックデザインや動画編集からキャリアをスタートさせ、グロービス経営大学院での「クリティカル・シンキング」や「マーケティング・経営戦略」の学び、さらには宅地建物取引士としての知見など、常に自己研鑽を続け新たな領域に挑戦してきました。デザインという「表現」のスキルと、ビジネスや教育現場での知見を掛け合わせ、多角的な視点から事業課題の解決に直結するクリエイティブを提供いたします。</w:t>
+        <w:rPr>
+          <w:rFonts w:ascii="メイリオ" w:eastAsia="メイリオ" w:hAnsi="メイリオ" w:cs="メイリオ" w:hint="eastAsia"/>
+          <w:color w:val="auto"/>
+          <w:sz w:val="19"/>
+          <w:szCs w:val="19"/>
+        </w:rPr>
+        <w:t>【</w:t>
+      </w:r>
+      <w:r>
+        <w:rPr>
+          <w:rFonts w:ascii="メイリオ" w:eastAsia="メイリオ" w:hAnsi="メイリオ" w:cs="メイリオ"/>
+          <w:color w:val="auto"/>
+          <w:sz w:val="19"/>
+          <w:szCs w:val="19"/>
+        </w:rPr>
+        <w:t xml:space="preserve">1. ECモールにおける「売上を作る」ディレクション能力】 </w:t>
       </w:r>
     </w:p>
     <w:p>
@@ -5837,13 +5907,264 @@
         <w:spacing w:line="180" w:lineRule="auto"/>
         <w:rPr>
           <w:rFonts w:ascii="メイリオ" w:eastAsia="メイリオ" w:hAnsi="メイリオ" w:cs="メイリオ"/>
+          <w:color w:val="auto"/>
+          <w:sz w:val="19"/>
+          <w:szCs w:val="19"/>
+        </w:rPr>
+      </w:pPr>
+      <w:r>
+        <w:rPr>
+          <w:rFonts w:ascii="メイリオ" w:eastAsia="メイリオ" w:hAnsi="メイリオ" w:cs="メイリオ"/>
+          <w:color w:val="auto"/>
+          <w:sz w:val="19"/>
+          <w:szCs w:val="19"/>
+        </w:rPr>
+        <w:t>家具・インテリア商材を中心としたEC事業において、楽天市場やYahoo!ショッピング等での多店舗展開を牽引してまいりました。「第一印象を決めるサムネイル画像」「商材のスケール感を伝える構成」「離脱を防ぐ画像配置」など、主要モールの特性に最適化したページ設計を得意としております。結果として、楽天市場における「こたつ」カテゴリシェア約20%、「い草商品」カテゴリシェア30%超という圧倒的な実績の獲得と維持に貢献いたしました。</w:t>
+      </w:r>
+    </w:p>
+    <w:p>
+      <w:pPr>
+        <w:pStyle w:val="10"/>
+        <w:spacing w:line="180" w:lineRule="auto"/>
+        <w:rPr>
+          <w:rFonts w:ascii="メイリオ" w:eastAsia="メイリオ" w:hAnsi="メイリオ" w:cs="メイリオ"/>
+          <w:color w:val="auto"/>
+          <w:sz w:val="19"/>
+          <w:szCs w:val="19"/>
+        </w:rPr>
+      </w:pPr>
+    </w:p>
+    <w:p>
+      <w:pPr>
+        <w:pStyle w:val="10"/>
+        <w:spacing w:line="180" w:lineRule="auto"/>
+        <w:rPr>
+          <w:rFonts w:ascii="メイリオ" w:eastAsia="メイリオ" w:hAnsi="メイリオ" w:cs="メイリオ"/>
+          <w:color w:val="auto"/>
+          <w:sz w:val="19"/>
+          <w:szCs w:val="19"/>
+        </w:rPr>
+      </w:pPr>
+      <w:r>
+        <w:rPr>
+          <w:rFonts w:ascii="メイリオ" w:eastAsia="メイリオ" w:hAnsi="メイリオ" w:cs="メイリオ" w:hint="eastAsia"/>
+          <w:color w:val="auto"/>
+          <w:sz w:val="19"/>
+          <w:szCs w:val="19"/>
+        </w:rPr>
+        <w:t>【</w:t>
+      </w:r>
+      <w:r>
+        <w:rPr>
+          <w:rFonts w:ascii="メイリオ" w:eastAsia="メイリオ" w:hAnsi="メイリオ" w:cs="メイリオ"/>
+          <w:color w:val="auto"/>
+          <w:sz w:val="19"/>
+          <w:szCs w:val="19"/>
+        </w:rPr>
+        <w:t xml:space="preserve">2. プレイングマネージャーとしての組織牽引力】 </w:t>
+      </w:r>
+    </w:p>
+    <w:p>
+      <w:pPr>
+        <w:pStyle w:val="10"/>
+        <w:spacing w:line="180" w:lineRule="auto"/>
+        <w:rPr>
+          <w:rFonts w:ascii="メイリオ" w:eastAsia="メイリオ" w:hAnsi="メイリオ" w:cs="メイリオ"/>
+          <w:color w:val="auto"/>
+          <w:sz w:val="19"/>
+          <w:szCs w:val="19"/>
+        </w:rPr>
+      </w:pPr>
+      <w:r>
+        <w:rPr>
+          <w:rFonts w:ascii="メイリオ" w:eastAsia="メイリオ" w:hAnsi="メイリオ" w:cs="メイリオ"/>
+          <w:color w:val="auto"/>
+          <w:sz w:val="19"/>
+          <w:szCs w:val="19"/>
+        </w:rPr>
+        <w:t>年間150～200ページの新商品ページ制作を行う5名体制のチームマネジメントを経験しました。進行管理やクオリティコントロールはもちろん、メンバー育成や</w:t>
+      </w:r>
+      <w:r>
+        <w:rPr>
+          <w:rFonts w:ascii="メイリオ" w:eastAsia="メイリオ" w:hAnsi="メイリオ" w:cs="メイリオ" w:hint="eastAsia"/>
+          <w:color w:val="auto"/>
+          <w:sz w:val="19"/>
+          <w:szCs w:val="19"/>
+        </w:rPr>
+        <w:t>様々なツール</w:t>
+      </w:r>
+      <w:r>
+        <w:rPr>
+          <w:rFonts w:ascii="メイリオ" w:eastAsia="メイリオ" w:hAnsi="メイリオ" w:cs="メイリオ"/>
+          <w:color w:val="auto"/>
+          <w:sz w:val="19"/>
+          <w:szCs w:val="19"/>
+        </w:rPr>
+        <w:t>を活用した業務フローの改善にも取り組み、制作スピードと品質の両立を担保する組織作りを推進してまいりました。</w:t>
+      </w:r>
+    </w:p>
+    <w:p>
+      <w:pPr>
+        <w:pStyle w:val="10"/>
+        <w:spacing w:line="180" w:lineRule="auto"/>
+        <w:rPr>
+          <w:rFonts w:ascii="メイリオ" w:eastAsia="メイリオ" w:hAnsi="メイリオ" w:cs="メイリオ"/>
+          <w:color w:val="auto"/>
+          <w:sz w:val="19"/>
+          <w:szCs w:val="19"/>
+        </w:rPr>
+      </w:pPr>
+    </w:p>
+    <w:p>
+      <w:pPr>
+        <w:pStyle w:val="10"/>
+        <w:spacing w:line="180" w:lineRule="auto"/>
+        <w:rPr>
+          <w:rFonts w:ascii="メイリオ" w:eastAsia="メイリオ" w:hAnsi="メイリオ" w:cs="メイリオ"/>
+          <w:color w:val="auto"/>
+          <w:sz w:val="19"/>
+          <w:szCs w:val="19"/>
+        </w:rPr>
+      </w:pPr>
+      <w:r>
+        <w:rPr>
+          <w:rFonts w:ascii="メイリオ" w:eastAsia="メイリオ" w:hAnsi="メイリオ" w:cs="メイリオ" w:hint="eastAsia"/>
+          <w:color w:val="auto"/>
+          <w:sz w:val="19"/>
+          <w:szCs w:val="19"/>
+        </w:rPr>
+        <w:t>【</w:t>
+      </w:r>
+      <w:r>
+        <w:rPr>
+          <w:rFonts w:ascii="メイリオ" w:eastAsia="メイリオ" w:hAnsi="メイリオ" w:cs="メイリオ"/>
+          <w:color w:val="auto"/>
+          <w:sz w:val="19"/>
+          <w:szCs w:val="19"/>
+        </w:rPr>
+        <w:t>3.</w:t>
+      </w:r>
+      <w:r>
+        <w:rPr>
+          <w:rFonts w:ascii="メイリオ" w:eastAsia="メイリオ" w:hAnsi="メイリオ" w:cs="メイリオ" w:hint="eastAsia"/>
+          <w:color w:val="auto"/>
+          <w:sz w:val="19"/>
+          <w:szCs w:val="19"/>
+        </w:rPr>
+        <w:t xml:space="preserve"> </w:t>
+      </w:r>
+      <w:r>
+        <w:rPr>
+          <w:rFonts w:ascii="メイリオ" w:eastAsia="メイリオ" w:hAnsi="メイリオ" w:cs="メイリオ"/>
+          <w:color w:val="auto"/>
+          <w:sz w:val="19"/>
+          <w:szCs w:val="19"/>
+        </w:rPr>
+        <w:t xml:space="preserve">新規B2Bスキームの構築プロセス経験】 </w:t>
+      </w:r>
+    </w:p>
+    <w:p>
+      <w:pPr>
+        <w:pStyle w:val="10"/>
+        <w:spacing w:line="180" w:lineRule="auto"/>
+        <w:rPr>
+          <w:rFonts w:ascii="メイリオ" w:eastAsia="メイリオ" w:hAnsi="メイリオ" w:cs="メイリオ"/>
+          <w:color w:val="auto"/>
+          <w:sz w:val="19"/>
+          <w:szCs w:val="19"/>
+        </w:rPr>
+      </w:pPr>
+      <w:r>
+        <w:rPr>
+          <w:rFonts w:ascii="メイリオ" w:eastAsia="メイリオ" w:hAnsi="メイリオ" w:cs="メイリオ"/>
+          <w:color w:val="auto"/>
+          <w:sz w:val="19"/>
+          <w:szCs w:val="19"/>
+        </w:rPr>
+        <w:t>EC運営で培った「家具特化の撮影知見」と「CVRを高めるLP制作ノウハウ」を強みとした、新規B2B事業（家具撮影・LP制作受託サービス「PIXAZ」）の立ち上げに参画しました。構成・絵コンテによる提案、撮影・LP納品に至るまでの「一気通貫した受託制作フロー」をゼロから整備・確立し、年間約50ページの受託案件を納期遅れなく完遂。自社の強みをサービス化し、実運用に乗せ</w:t>
+      </w:r>
+      <w:r>
+        <w:rPr>
+          <w:rFonts w:ascii="メイリオ" w:eastAsia="メイリオ" w:hAnsi="メイリオ" w:cs="メイリオ" w:hint="eastAsia"/>
+          <w:color w:val="auto"/>
+          <w:sz w:val="19"/>
+          <w:szCs w:val="19"/>
+        </w:rPr>
+        <w:t>るまでの「</w:t>
+      </w:r>
+      <w:r>
+        <w:rPr>
+          <w:rFonts w:ascii="メイリオ" w:eastAsia="メイリオ" w:hAnsi="メイリオ" w:cs="メイリオ"/>
+          <w:color w:val="auto"/>
+          <w:sz w:val="19"/>
+          <w:szCs w:val="19"/>
+        </w:rPr>
+        <w:t>0→1フェーズ」を実行し形にする推進力を有しております。</w:t>
+      </w:r>
+    </w:p>
+    <w:p>
+      <w:pPr>
+        <w:pStyle w:val="10"/>
+        <w:spacing w:line="180" w:lineRule="auto"/>
+        <w:rPr>
+          <w:rFonts w:ascii="メイリオ" w:eastAsia="メイリオ" w:hAnsi="メイリオ" w:cs="メイリオ" w:hint="eastAsia"/>
+          <w:color w:val="auto"/>
+          <w:sz w:val="19"/>
+          <w:szCs w:val="19"/>
+        </w:rPr>
+      </w:pPr>
+    </w:p>
+    <w:p>
+      <w:pPr>
+        <w:pStyle w:val="10"/>
+        <w:spacing w:line="180" w:lineRule="auto"/>
+        <w:rPr>
+          <w:rFonts w:ascii="メイリオ" w:eastAsia="メイリオ" w:hAnsi="メイリオ" w:cs="メイリオ"/>
+          <w:color w:val="auto"/>
+          <w:sz w:val="19"/>
+          <w:szCs w:val="19"/>
+        </w:rPr>
+      </w:pPr>
+      <w:r>
+        <w:rPr>
+          <w:rFonts w:ascii="メイリオ" w:eastAsia="メイリオ" w:hAnsi="メイリオ" w:cs="メイリオ" w:hint="eastAsia"/>
+          <w:color w:val="auto"/>
+          <w:sz w:val="19"/>
+          <w:szCs w:val="19"/>
+        </w:rPr>
+        <w:t>【</w:t>
+      </w:r>
+      <w:r>
+        <w:rPr>
+          <w:rFonts w:ascii="メイリオ" w:eastAsia="メイリオ" w:hAnsi="メイリオ" w:cs="メイリオ"/>
+          <w:color w:val="auto"/>
+          <w:sz w:val="19"/>
+          <w:szCs w:val="19"/>
+        </w:rPr>
+        <w:t xml:space="preserve">4. 多分野の知見を掛け合わせた課題解決力】 </w:t>
+      </w:r>
+    </w:p>
+    <w:p>
+      <w:pPr>
+        <w:pStyle w:val="10"/>
+        <w:spacing w:line="180" w:lineRule="auto"/>
+        <w:rPr>
+          <w:rFonts w:ascii="メイリオ" w:eastAsia="メイリオ" w:hAnsi="メイリオ" w:cs="メイリオ"/>
           <w:b/>
           <w:bCs/>
           <w:sz w:val="19"/>
           <w:szCs w:val="19"/>
         </w:rPr>
       </w:pPr>
-      <w:r/>
+      <w:r>
+        <w:rPr>
+          <w:rFonts w:ascii="メイリオ" w:eastAsia="メイリオ" w:hAnsi="メイリオ" w:cs="メイリオ"/>
+          <w:color w:val="auto"/>
+          <w:sz w:val="19"/>
+          <w:szCs w:val="19"/>
+        </w:rPr>
+        <w:t>グラフィックデザインや動画編集からキャリアをスタートさせ、グロービス経営大学院での「クリティカル・シンキング」や「マーケティング・経営戦略」の学び、常に自己研鑽を続け新たな領域に挑戦してきました。デザインという「表現」のスキルと、ビジネスや経営という「戦略」の視点を掛け合わせ、事業の成長に直結するクリエイティブを提供いたします。</w:t>
+      </w:r>
     </w:p>
     <w:p>
       <w:pPr>
@@ -6942,6 +7263,7 @@
   <w:style w:type="character" w:default="1" w:styleId="a0">
     <w:name w:val="Default Paragraph Font"/>
     <w:uiPriority w:val="1"/>
+    <w:semiHidden/>
     <w:unhideWhenUsed/>
   </w:style>
   <w:style w:type="table" w:default="1" w:styleId="a1">

</xml_diff>